<commit_message>
Deploying to gh-pages from @ UCD-SERG/qwt@4997944083e1bbe39f4b3cb266f5dd3bff4501f9 🚀
</commit_message>
<xml_diff>
--- a/chapters/chapter2.docx
+++ b/chapters/chapter2.docx
@@ -193,6 +193,34 @@
         </m:oMath>
       </m:oMathPara>
       <w:bookmarkEnd w:id="9"/>
+    </w:p>
+    <w:p>
+      <w:pPr>
+        <w:pStyle w:val="FirstParagraph"/>
+      </w:pPr>
+      <w:r>
+        <w:t xml:space="preserve">Direct link to the equation anchor:</w:t>
+      </w:r>
+      <w:r>
+        <w:t xml:space="preserve"> </w:t>
+      </w:r>
+      <w:r>
+        <w:t xml:space="preserve">See</w:t>
+      </w:r>
+      <w:r>
+        <w:t xml:space="preserve"> </w:t>
+      </w:r>
+      <w:hyperlink w:anchor="eq-gaussian-integral">
+        <w:r>
+          <w:rPr>
+            <w:rStyle w:val="Hyperlink"/>
+          </w:rPr>
+          <w:t xml:space="preserve">Equation 1</w:t>
+        </w:r>
+      </w:hyperlink>
+      <w:r>
+        <w:t xml:space="preserve">.</w:t>
+      </w:r>
     </w:p>
     <w:bookmarkEnd w:id="10"/>
     <w:bookmarkStart w:id="12" w:name="tables"/>

</xml_diff>